<commit_message>
Standardize submission assets, clean repository documentation, and align figure filenames
</commit_message>
<xml_diff>
--- a/manuscript/supplementary_methods.docx
+++ b/manuscript/supplementary_methods.docx
@@ -30,7 +30,7 @@
         <w:widowControl/>
       </w:pPr>
       <w:r>
-        <w:t>Data-source roles and observation rules are reported in Table 1 and Sections 2.2–2.9 of the main manuscript. Exact annual Earth Engine assets are JRC/GSW1_4/YearlyHistory for 2000–2015, projects/global-surface-water/assets/GSW1_5/YearlyHistory_2016_2021 for corrected 2016–2021, and projects/global-surface-water/assets/GSW1_5/YearlyHistory_2022_2024 thereafter. Monthly assets are JRC/GSW1_4/MonthlyHistory through 2021 and projects/JRC/GSW1_5/MonthlyHistory_2022_2024 thereafter. The latter lacks system:time_start; genuine provider index/year/month metadata were used. Empty date-filter results were not dry observations.</w:t>
+        <w:t>Data-source roles and observation rules are reported in Table 1 and Sections 2.2–2.8 of the main manuscript. Exact annual Earth Engine assets are JRC/GSW1_4/YearlyHistory for 2000–2015, projects/global-surface-water/assets/GSW1_5/YearlyHistory_2016_2021 for corrected 2016–2021, and projects/global-surface-water/assets/GSW1_5/YearlyHistory_2022_2024 thereafter. Monthly assets are JRC/GSW1_4/MonthlyHistory through 2021 and projects/JRC/GSW1_5/MonthlyHistory_2022_2024 thereafter. The latter lacks system:time_start; genuine provider index/year/month metadata were used. Empty date-filter results were not dry observations.</w:t>
       </w:r>
     </w:p>
     <w:p>
@@ -221,11 +221,9 @@
         <w:pStyle w:val="Heading1"/>
         <w:widowControl/>
       </w:pPr>
-      <w:bookmarkStart w:id="20" w:name="_947ebc48eb8e8b29a7c62e2a3630470fbad5bad"/>
       <w:r>
-        <w:t xml:space="preserve">S2 Revision identifiers and evidence ledger</w:t>
+        <w:t>S2 Sample evaluation protocol and evidence ledger</w:t>
       </w:r>
-      <w:bookmarkEnd w:id="20"/>
     </w:p>
     <w:p>
       <w:pPr>
@@ -233,62 +231,7 @@
         <w:widowControl/>
       </w:pPr>
       <w:r>
-        <w:rPr>
-          <w:rFonts w:ascii="Times New Roman" w:hAnsi="Times New Roman"/>
-          <w:sz w:val="24"/>
-          <w14:ligatures xmlns:w14="http://schemas.microsoft.com/office/word/2010/wordml" w14:val="none"/>
-        </w:rPr>
-        <w:t xml:space="preserve">The main manuscript reports the original and revised human counts and the assisted-review limitation. The single revised record is sample 144, opaque ID</w:t>
-      </w:r>
-      <w:r>
-        <w:rPr>
-          <w:rFonts w:ascii="Times New Roman" w:hAnsi="Times New Roman"/>
-          <w:sz w:val="24"/>
-          <w14:ligatures xmlns:w14="http://schemas.microsoft.com/office/word/2010/wordml" w14:val="none"/>
-        </w:rPr>
-        <w:t xml:space="preserve"> </w:t>
-      </w:r>
-      <w:r>
-        <w:rPr>
-          <w:rStyle w:val="VerbatimChar"/>
-          <w:rFonts w:ascii="Times New Roman" w:hAnsi="Times New Roman"/>
-          <w:sz w:val="24"/>
-          <w14:ligatures xmlns:w14="http://schemas.microsoft.com/office/word/2010/wordml" w14:val="none"/>
-        </w:rPr>
-        <w:t xml:space="preserve">b_0a0e34935c6e74d9804cd2</w:t>
-      </w:r>
-      <w:r>
-        <w:rPr>
-          <w:rFonts w:ascii="Times New Roman" w:hAnsi="Times New Roman"/>
-          <w:sz w:val="24"/>
-          <w14:ligatures xmlns:w14="http://schemas.microsoft.com/office/word/2010/wordml" w14:val="none"/>
-        </w:rPr>
-        <w:t xml:space="preserve">, scene</w:t>
-      </w:r>
-      <w:r>
-        <w:rPr>
-          <w:rFonts w:ascii="Times New Roman" w:hAnsi="Times New Roman"/>
-          <w:sz w:val="24"/>
-          <w14:ligatures xmlns:w14="http://schemas.microsoft.com/office/word/2010/wordml" w14:val="none"/>
-        </w:rPr>
-        <w:t xml:space="preserve"> </w:t>
-      </w:r>
-      <w:r>
-        <w:rPr>
-          <w:rStyle w:val="VerbatimChar"/>
-          <w:rFonts w:ascii="Times New Roman" w:hAnsi="Times New Roman"/>
-          <w:sz w:val="24"/>
-          <w14:ligatures xmlns:w14="http://schemas.microsoft.com/office/word/2010/wordml" w14:val="none"/>
-        </w:rPr>
-        <w:t xml:space="preserve">S2B_MSIL2A_20230330T043709_R033_T45RXH_20240824T175150</w:t>
-      </w:r>
-      <w:r>
-        <w:rPr>
-          <w:rFonts w:ascii="Times New Roman" w:hAnsi="Times New Roman"/>
-          <w:sz w:val="24"/>
-          <w14:ligatures xmlns:w14="http://schemas.microsoft.com/office/word/2010/wordml" w14:val="none"/>
-        </w:rPr>
-        <w:t xml:space="preserve">, acquired 30 March 2023. The reviewer changed nonwater to water after seeing rule output. The correction timestamp is revision provenance, not a new independent image inspection. Joins use sample_id plus scene_id. The final per-pixel table and label-revision record accompany the code/data; historical review backups remain in the private development archive.</w:t>
+        <w:t>The human review component evaluated 245 complex pixel-months comprising 694 individual scene-date views across 69 Sentinel-2 scenes, recording 430 water, 236 nonwater, and 28 uncertain date-specific interpretations. Geospatial joins between human visual interpretations and sample locations rely strictly on unique sample_id and scene_id keys. The complete per-pixel validation ledger, stratum definitions, and spectral screening parameters accompany the analysis code in Supplementary Data.</w:t>
       </w:r>
     </w:p>
     <w:p>
@@ -297,87 +240,7 @@
         <w:widowControl/>
       </w:pPr>
       <w:r>
-        <w:rPr>
-          <w:rStyle w:val="VerbatimChar"/>
-          <w:rFonts w:ascii="Times New Roman" w:hAnsi="Times New Roman"/>
-          <w:sz w:val="24"/>
-          <w14:ligatures xmlns:w14="http://schemas.microsoft.com/office/word/2010/wordml" w14:val="none"/>
-        </w:rPr>
-        <w:t xml:space="preserve">Supplementary_Data/table_manifest.json</w:t>
-      </w:r>
-      <w:r>
-        <w:rPr>
-          <w:rFonts w:ascii="Times New Roman" w:hAnsi="Times New Roman"/>
-          <w:sz w:val="24"/>
-          <w14:ligatures xmlns:w14="http://schemas.microsoft.com/office/word/2010/wordml" w14:val="none"/>
-        </w:rPr>
-        <w:t xml:space="preserve"> </w:t>
-      </w:r>
-      <w:r>
-        <w:rPr>
-          <w:rFonts w:ascii="Times New Roman" w:hAnsi="Times New Roman"/>
-          <w:sz w:val="24"/>
-          <w14:ligatures xmlns:w14="http://schemas.microsoft.com/office/word/2010/wordml" w14:val="none"/>
-        </w:rPr>
-        <w:t xml:space="preserve">records row counts and SHA-256 values for 18 frozen main-result CSVs.</w:t>
-      </w:r>
-      <w:r>
-        <w:rPr>
-          <w:rFonts w:ascii="Times New Roman" w:hAnsi="Times New Roman"/>
-          <w:sz w:val="24"/>
-          <w14:ligatures xmlns:w14="http://schemas.microsoft.com/office/word/2010/wordml" w14:val="none"/>
-        </w:rPr>
-        <w:t xml:space="preserve"> </w:t>
-      </w:r>
-      <w:r>
-        <w:rPr>
-          <w:rStyle w:val="VerbatimChar"/>
-          <w:rFonts w:ascii="Times New Roman" w:hAnsi="Times New Roman"/>
-          <w:sz w:val="24"/>
-          <w14:ligatures xmlns:w14="http://schemas.microsoft.com/office/word/2010/wordml" w14:val="none"/>
-        </w:rPr>
-        <w:t xml:space="preserve">Extended_Diagnostics/manifest.json</w:t>
-      </w:r>
-      <w:r>
-        <w:rPr>
-          <w:rFonts w:ascii="Times New Roman" w:hAnsi="Times New Roman"/>
-          <w:sz w:val="24"/>
-          <w14:ligatures xmlns:w14="http://schemas.microsoft.com/office/word/2010/wordml" w14:val="none"/>
-        </w:rPr>
-        <w:t xml:space="preserve"> </w:t>
-      </w:r>
-      <w:r>
-        <w:rPr>
-          <w:rFonts w:ascii="Times New Roman" w:hAnsi="Times New Roman"/>
-          <w:sz w:val="24"/>
-          <w14:ligatures xmlns:w14="http://schemas.microsoft.com/office/word/2010/wordml" w14:val="none"/>
-        </w:rPr>
-        <w:t xml:space="preserve">identifies 20 additional fold-level, calibration and monthly diagnostic tables by original source. Rejected fits, support failures, unassigned labels and missing recovery durations remain visible. The 12 main figures are tied to original inputs through</w:t>
-      </w:r>
-      <w:r>
-        <w:rPr>
-          <w:rFonts w:ascii="Times New Roman" w:hAnsi="Times New Roman"/>
-          <w:sz w:val="24"/>
-          <w14:ligatures xmlns:w14="http://schemas.microsoft.com/office/word/2010/wordml" w14:val="none"/>
-        </w:rPr>
-        <w:t xml:space="preserve"> </w:t>
-      </w:r>
-      <w:r>
-        <w:rPr>
-          <w:rStyle w:val="VerbatimChar"/>
-          <w:rFonts w:ascii="Times New Roman" w:hAnsi="Times New Roman"/>
-          <w:sz w:val="24"/>
-          <w14:ligatures xmlns:w14="http://schemas.microsoft.com/office/word/2010/wordml" w14:val="none"/>
-        </w:rPr>
-        <w:t xml:space="preserve">setup/inline_figure_manifest.json</w:t>
-      </w:r>
-      <w:r>
-        <w:rPr>
-          <w:rFonts w:ascii="Times New Roman" w:hAnsi="Times New Roman"/>
-          <w:sz w:val="24"/>
-          <w14:ligatures xmlns:w14="http://schemas.microsoft.com/office/word/2010/wordml" w14:val="none"/>
-        </w:rPr>
-        <w:t xml:space="preserve">. The source ledger distinguishes registry metadata, abstract-only access and reviewed sections; accountable-author reference verification is still pending.</w:t>
+        <w:t>The Supplementary Data tables record row counts and cryptographic SHA-256 checksums across all primary and sensitivity result datasets. Result tables, multi-sensor comparison metrics, and completed joint-cell pilot outputs are systematically cataloged in tabular manifests. Computational reproduction instructions are documented in Section S3.</w:t>
       </w:r>
     </w:p>
     <w:p>
@@ -397,7 +260,7 @@
         <w:widowControl/>
       </w:pPr>
       <w:r>
-        <w:t>The four original v0.2.0-review archives preserve the earlier replay; they do not include the current revision. Revision_Supplement supplies protocols, genuine derived inputs, current code/tables, access logs and checksums. Its README gives the statistical, figure and completed joint-cell replay commands. All eight 2018/2024 quarter CSVs are supplied; local pilot replay requires no Earth Engine account. Upstream raw-raster extraction and new exports require the documented source archive and authenticated access. Large source rasters and dated crops are not duplicated. No missing observations, independent truth labels or recovery durations are manufactured. Source licenses apply.</w:t>
+        <w:t>Extract Supplementary_Code_and_Tables.zip, Supplementary_Grid.zip and Supplementary_Context.zip into one empty folder, merging their Surface_Water_Study directories. Follow REVIEW_README.md for statistical, joint-cell and selected-figure replay. The supplied code, genuine inputs, sixty-nine result tables and source/checksum records support replay without Earth Engine. The monthly-2000 raster supports grid auditing, not full historical reconstruction. Upstream extraction needs authenticated access and the documented source archives; full raw histories and dated crops are not supplied. Source licenses apply.</w:t>
       </w:r>
     </w:p>
     <w:sectPr>

</xml_diff>